<commit_message>
Remove unverified DAU metric from Resume's Ad Venture Studio entry
The "3.9K daily active users" figure was never added to the live portfolio
site's Experience section, only to the Resume generator. Drop it there too
and keep the bullet points scoped to role/responsibility, not an unverified
number.

Co-Authored-By: Claude Sonnet 5 <noreply@anthropic.com>
</commit_message>
<xml_diff>
--- a/CV_DOCX/Sitt_Min_Thar_Resume.docx
+++ b/CV_DOCX/Sitt_Min_Thar_Resume.docx
@@ -158,20 +158,6 @@
           <w:sz w:val="21"/>
         </w:rPr>
         <w:t>Building and shipping mobile apps for App Store and Google Play, owning product engineering, store releases, and app infrastructure</w:t>
-      </w:r>
-    </w:p>
-    <w:p>
-      <w:pPr>
-        <w:pStyle w:val="ListBullet"/>
-        <w:spacing w:after="40"/>
-        <w:ind w:left="360"/>
-      </w:pPr>
-      <w:r>
-        <w:rPr>
-          <w:rFonts w:ascii="Times New Roman" w:hAnsi="Times New Roman"/>
-          <w:sz w:val="21"/>
-        </w:rPr>
-        <w:t>Developed and shipped Android applications now serving 3.9K daily active users, driving week-over-week growth in retention and revenue</w:t>
       </w:r>
     </w:p>
     <w:p>

</xml_diff>

<commit_message>
Add the Malibu role to the Resume to match the site bio
The site bio has carried the release-acceptance role at Malibu for a
while; the Resume was the one place still missing it. Same wording and
the same position in the list as the Experience section.

Co-Authored-By: Claude Opus 5 <noreply@anthropic.com>
</commit_message>
<xml_diff>
--- a/CV_DOCX/Sitt_Min_Thar_Resume.docx
+++ b/CV_DOCX/Sitt_Min_Thar_Resume.docx
@@ -294,9 +294,97 @@
                 <w:b/>
                 <w:sz w:val="21"/>
               </w:rPr>
+              <w:t xml:space="preserve">Release-Acceptance Engineer | </w:t>
+            </w:r>
+            <w:hyperlink r:id="rId10">
+              <w:r>
+                <w:rPr>
+                  <w:rFonts w:ascii="Times New Roman" w:hAnsi="Times New Roman"/>
+                  <w:sz w:val="21"/>
+                  <w:color w:val="0563C1"/>
+                  <w:u w:val="single"/>
+                  <w:b/>
+                </w:rPr>
+                <w:t>Malibu</w:t>
+              </w:r>
+            </w:hyperlink>
+          </w:p>
+        </w:tc>
+        <w:tc>
+          <w:tcPr>
+            <w:tcW w:type="dxa" w:w="1152"/>
+            <w:tcW w:w="1152" w:type="dxa"/>
+            <w:tcMar>
+              <w:left w:w="0" w:type="dxa"/>
+              <w:right w:w="0" w:type="dxa"/>
+            </w:tcMar>
+          </w:tcPr>
+          <w:p>
+            <w:pPr>
+              <w:spacing w:after="0"/>
+              <w:jc w:val="right"/>
+            </w:pPr>
+            <w:r>
+              <w:rPr>
+                <w:rFonts w:ascii="Times New Roman" w:hAnsi="Times New Roman"/>
+                <w:b/>
+                <w:sz w:val="21"/>
+              </w:rPr>
+              <w:t>Present</w:t>
+            </w:r>
+          </w:p>
+        </w:tc>
+      </w:tr>
+    </w:tbl>
+    <w:p>
+      <w:pPr>
+        <w:pStyle w:val="ListBullet"/>
+        <w:spacing w:after="40"/>
+        <w:ind w:left="360"/>
+      </w:pPr>
+      <w:r>
+        <w:rPr>
+          <w:rFonts w:ascii="Times New Roman" w:hAnsi="Times New Roman"/>
+          <w:sz w:val="21"/>
+        </w:rPr>
+        <w:t>Independent release-acceptance engineer for a macOS distributed-compute marketplace, serving as the physical-hardware validation gate between CI-green and fleet rollout</w:t>
+      </w:r>
+    </w:p>
+    <w:tbl>
+      <w:tblPr>
+        <w:tblW w:type="auto" w:w="0"/>
+        <w:tblLayout w:type="fixed"/>
+        <w:tblLook w:firstColumn="1" w:firstRow="1" w:lastColumn="0" w:lastRow="0" w:noHBand="0" w:noVBand="1" w:val="04A0"/>
+        <w:tblLayout w:type="fixed"/>
+        <w:tblW w:w="10080" w:type="dxa"/>
+      </w:tblPr>
+      <w:tblGrid>
+        <w:gridCol w:w="5256"/>
+        <w:gridCol w:w="5256"/>
+      </w:tblGrid>
+      <w:tr>
+        <w:tc>
+          <w:tcPr>
+            <w:tcW w:type="dxa" w:w="8928"/>
+            <w:tcW w:w="8928" w:type="dxa"/>
+            <w:tcMar>
+              <w:left w:w="0" w:type="dxa"/>
+              <w:right w:w="0" w:type="dxa"/>
+            </w:tcMar>
+          </w:tcPr>
+          <w:p>
+            <w:pPr>
+              <w:spacing w:after="0"/>
+            </w:pPr>
+            <w:r>
+              <w:rPr>
+                <w:rFonts w:ascii="Times New Roman" w:hAnsi="Times New Roman"/>
+                <w:b/>
+                <w:sz w:val="21"/>
+              </w:rPr>
               <w:t xml:space="preserve">Software Development Intern | </w:t>
             </w:r>
-            <w:hyperlink r:id="rId10">
+            <w:hyperlink r:id="rId11">
               <w:r>
                 <w:rPr>
                   <w:rFonts w:ascii="Times New Roman" w:hAnsi="Times New Roman"/>
@@ -512,7 +600,7 @@
       <w:pPr>
         <w:spacing w:after="0"/>
       </w:pPr>
-      <w:hyperlink r:id="rId11">
+      <w:hyperlink r:id="rId12">
         <w:r>
           <w:rPr>
             <w:rFonts w:ascii="Times New Roman" w:hAnsi="Times New Roman"/>
@@ -543,7 +631,7 @@
       <w:pPr>
         <w:spacing w:after="0"/>
       </w:pPr>
-      <w:hyperlink r:id="rId12">
+      <w:hyperlink r:id="rId13">
         <w:r>
           <w:rPr>
             <w:rFonts w:ascii="Times New Roman" w:hAnsi="Times New Roman"/>
@@ -574,7 +662,7 @@
       <w:pPr>
         <w:spacing w:after="0"/>
       </w:pPr>
-      <w:hyperlink r:id="rId13">
+      <w:hyperlink r:id="rId14">
         <w:r>
           <w:rPr>
             <w:rFonts w:ascii="Times New Roman" w:hAnsi="Times New Roman"/>
@@ -605,7 +693,7 @@
       <w:pPr>
         <w:spacing w:after="0"/>
       </w:pPr>
-      <w:hyperlink r:id="rId14">
+      <w:hyperlink r:id="rId15">
         <w:r>
           <w:rPr>
             <w:rFonts w:ascii="Times New Roman" w:hAnsi="Times New Roman"/>
@@ -636,7 +724,7 @@
       <w:pPr>
         <w:spacing w:after="0"/>
       </w:pPr>
-      <w:hyperlink r:id="rId15">
+      <w:hyperlink r:id="rId16">
         <w:r>
           <w:rPr>
             <w:rFonts w:ascii="Times New Roman" w:hAnsi="Times New Roman"/>
@@ -667,7 +755,7 @@
       <w:pPr>
         <w:spacing w:after="0"/>
       </w:pPr>
-      <w:hyperlink r:id="rId16">
+      <w:hyperlink r:id="rId17">
         <w:r>
           <w:rPr>
             <w:rFonts w:ascii="Times New Roman" w:hAnsi="Times New Roman"/>
@@ -698,7 +786,7 @@
       <w:pPr>
         <w:spacing w:after="0"/>
       </w:pPr>
-      <w:hyperlink r:id="rId17">
+      <w:hyperlink r:id="rId18">
         <w:r>
           <w:rPr>
             <w:rFonts w:ascii="Times New Roman" w:hAnsi="Times New Roman"/>

</xml_diff>

<commit_message>
Add VNG to the Resume
The site's Experience section, Biographical Sketch, and intro page
all carry the VNG onsite Business Analyst role; the Resume was the
one place still missing it. Same wording and framing as the site:
part of the outsourcing partner delivering VNG's platform, not a
direct VNG hire.

Co-Authored-By: Claude Sonnet 5 <noreply@anthropic.com>
</commit_message>
<xml_diff>
--- a/CV_DOCX/Sitt_Min_Thar_Resume.docx
+++ b/CV_DOCX/Sitt_Min_Thar_Resume.docx
@@ -206,9 +206,97 @@
                 <w:b/>
                 <w:sz w:val="21"/>
               </w:rPr>
+              <w:t xml:space="preserve">Business Analyst (Onsite) | </w:t>
+            </w:r>
+            <w:hyperlink r:id="rId9">
+              <w:r>
+                <w:rPr>
+                  <w:rFonts w:ascii="Times New Roman" w:hAnsi="Times New Roman"/>
+                  <w:sz w:val="21"/>
+                  <w:color w:val="0563C1"/>
+                  <w:u w:val="single"/>
+                  <w:b/>
+                </w:rPr>
+                <w:t>VNG</w:t>
+              </w:r>
+            </w:hyperlink>
+          </w:p>
+        </w:tc>
+        <w:tc>
+          <w:tcPr>
+            <w:tcW w:type="dxa" w:w="1152"/>
+            <w:tcW w:w="1152" w:type="dxa"/>
+            <w:tcMar>
+              <w:left w:w="0" w:type="dxa"/>
+              <w:right w:w="0" w:type="dxa"/>
+            </w:tcMar>
+          </w:tcPr>
+          <w:p>
+            <w:pPr>
+              <w:spacing w:after="0"/>
+              <w:jc w:val="right"/>
+            </w:pPr>
+            <w:r>
+              <w:rPr>
+                <w:rFonts w:ascii="Times New Roman" w:hAnsi="Times New Roman"/>
+                <w:b/>
+                <w:sz w:val="21"/>
+              </w:rPr>
+              <w:t>2026 -- Present</w:t>
+            </w:r>
+          </w:p>
+        </w:tc>
+      </w:tr>
+    </w:tbl>
+    <w:p>
+      <w:pPr>
+        <w:pStyle w:val="ListBullet"/>
+        <w:spacing w:after="40"/>
+        <w:ind w:left="360"/>
+      </w:pPr>
+      <w:r>
+        <w:rPr>
+          <w:rFonts w:ascii="Times New Roman" w:hAnsi="Times New Roman"/>
+          <w:sz w:val="21"/>
+        </w:rPr>
+        <w:t>Business Analyst, part of the outsourcing partner delivering an AI-enabled Legal Operations platform onsite at VNG for their Legal and Compliance function</w:t>
+      </w:r>
+    </w:p>
+    <w:tbl>
+      <w:tblPr>
+        <w:tblW w:type="auto" w:w="0"/>
+        <w:tblLayout w:type="fixed"/>
+        <w:tblLook w:firstColumn="1" w:firstRow="1" w:lastColumn="0" w:lastRow="0" w:noHBand="0" w:noVBand="1" w:val="04A0"/>
+        <w:tblLayout w:type="fixed"/>
+        <w:tblW w:w="10080" w:type="dxa"/>
+      </w:tblPr>
+      <w:tblGrid>
+        <w:gridCol w:w="5256"/>
+        <w:gridCol w:w="5256"/>
+      </w:tblGrid>
+      <w:tr>
+        <w:tc>
+          <w:tcPr>
+            <w:tcW w:type="dxa" w:w="8928"/>
+            <w:tcW w:w="8928" w:type="dxa"/>
+            <w:tcMar>
+              <w:left w:w="0" w:type="dxa"/>
+              <w:right w:w="0" w:type="dxa"/>
+            </w:tcMar>
+          </w:tcPr>
+          <w:p>
+            <w:pPr>
+              <w:spacing w:after="0"/>
+            </w:pPr>
+            <w:r>
+              <w:rPr>
+                <w:rFonts w:ascii="Times New Roman" w:hAnsi="Times New Roman"/>
+                <w:b/>
+                <w:sz w:val="21"/>
+              </w:rPr>
               <w:t xml:space="preserve">Founding Engineer | </w:t>
             </w:r>
-            <w:hyperlink r:id="rId9">
+            <w:hyperlink r:id="rId10">
               <w:r>
                 <w:rPr>
                   <w:rFonts w:ascii="Times New Roman" w:hAnsi="Times New Roman"/>
@@ -296,7 +384,7 @@
               </w:rPr>
               <w:t xml:space="preserve">Release-Acceptance Engineer | </w:t>
             </w:r>
-            <w:hyperlink r:id="rId10">
+            <w:hyperlink r:id="rId11">
               <w:r>
                 <w:rPr>
                   <w:rFonts w:ascii="Times New Roman" w:hAnsi="Times New Roman"/>
@@ -384,7 +472,7 @@
               </w:rPr>
               <w:t xml:space="preserve">Software Development Intern | </w:t>
             </w:r>
-            <w:hyperlink r:id="rId11">
+            <w:hyperlink r:id="rId12">
               <w:r>
                 <w:rPr>
                   <w:rFonts w:ascii="Times New Roman" w:hAnsi="Times New Roman"/>
@@ -600,7 +688,7 @@
       <w:pPr>
         <w:spacing w:after="0"/>
       </w:pPr>
-      <w:hyperlink r:id="rId12">
+      <w:hyperlink r:id="rId13">
         <w:r>
           <w:rPr>
             <w:rFonts w:ascii="Times New Roman" w:hAnsi="Times New Roman"/>
@@ -631,7 +719,7 @@
       <w:pPr>
         <w:spacing w:after="0"/>
       </w:pPr>
-      <w:hyperlink r:id="rId13">
+      <w:hyperlink r:id="rId14">
         <w:r>
           <w:rPr>
             <w:rFonts w:ascii="Times New Roman" w:hAnsi="Times New Roman"/>
@@ -662,7 +750,7 @@
       <w:pPr>
         <w:spacing w:after="0"/>
       </w:pPr>
-      <w:hyperlink r:id="rId14">
+      <w:hyperlink r:id="rId15">
         <w:r>
           <w:rPr>
             <w:rFonts w:ascii="Times New Roman" w:hAnsi="Times New Roman"/>
@@ -693,7 +781,7 @@
       <w:pPr>
         <w:spacing w:after="0"/>
       </w:pPr>
-      <w:hyperlink r:id="rId15">
+      <w:hyperlink r:id="rId16">
         <w:r>
           <w:rPr>
             <w:rFonts w:ascii="Times New Roman" w:hAnsi="Times New Roman"/>
@@ -724,7 +812,7 @@
       <w:pPr>
         <w:spacing w:after="0"/>
       </w:pPr>
-      <w:hyperlink r:id="rId16">
+      <w:hyperlink r:id="rId17">
         <w:r>
           <w:rPr>
             <w:rFonts w:ascii="Times New Roman" w:hAnsi="Times New Roman"/>
@@ -755,7 +843,7 @@
       <w:pPr>
         <w:spacing w:after="0"/>
       </w:pPr>
-      <w:hyperlink r:id="rId17">
+      <w:hyperlink r:id="rId18">
         <w:r>
           <w:rPr>
             <w:rFonts w:ascii="Times New Roman" w:hAnsi="Times New Roman"/>
@@ -786,7 +874,7 @@
       <w:pPr>
         <w:spacing w:after="0"/>
       </w:pPr>
-      <w:hyperlink r:id="rId18">
+      <w:hyperlink r:id="rId19">
         <w:r>
           <w:rPr>
             <w:rFonts w:ascii="Times New Roman" w:hAnsi="Times New Roman"/>

</xml_diff>

<commit_message>
Remove the VNG engagement from the portfolio and Resume
The onsite Business Analyst role is ending after 30 September, so
pull it from the intro page bio, Biographical Sketch, Experience,
and the Resume. About.tsx's summary row drops back to two columns
now that there's nothing to put in the third.

Co-Authored-By: Claude Sonnet 5 <noreply@anthropic.com>
</commit_message>
<xml_diff>
--- a/CV_DOCX/Sitt_Min_Thar_Resume.docx
+++ b/CV_DOCX/Sitt_Min_Thar_Resume.docx
@@ -206,97 +206,9 @@
                 <w:b/>
                 <w:sz w:val="21"/>
               </w:rPr>
-              <w:t xml:space="preserve">Business Analyst (Onsite) | </w:t>
+              <w:t xml:space="preserve">Founding Engineer | </w:t>
             </w:r>
             <w:hyperlink r:id="rId9">
-              <w:r>
-                <w:rPr>
-                  <w:rFonts w:ascii="Times New Roman" w:hAnsi="Times New Roman"/>
-                  <w:sz w:val="21"/>
-                  <w:color w:val="0563C1"/>
-                  <w:u w:val="single"/>
-                  <w:b/>
-                </w:rPr>
-                <w:t>VNG</w:t>
-              </w:r>
-            </w:hyperlink>
-          </w:p>
-        </w:tc>
-        <w:tc>
-          <w:tcPr>
-            <w:tcW w:type="dxa" w:w="1152"/>
-            <w:tcW w:w="1152" w:type="dxa"/>
-            <w:tcMar>
-              <w:left w:w="0" w:type="dxa"/>
-              <w:right w:w="0" w:type="dxa"/>
-            </w:tcMar>
-          </w:tcPr>
-          <w:p>
-            <w:pPr>
-              <w:spacing w:after="0"/>
-              <w:jc w:val="right"/>
-            </w:pPr>
-            <w:r>
-              <w:rPr>
-                <w:rFonts w:ascii="Times New Roman" w:hAnsi="Times New Roman"/>
-                <w:b/>
-                <w:sz w:val="21"/>
-              </w:rPr>
-              <w:t>2026 -- Present</w:t>
-            </w:r>
-          </w:p>
-        </w:tc>
-      </w:tr>
-    </w:tbl>
-    <w:p>
-      <w:pPr>
-        <w:pStyle w:val="ListBullet"/>
-        <w:spacing w:after="40"/>
-        <w:ind w:left="360"/>
-      </w:pPr>
-      <w:r>
-        <w:rPr>
-          <w:rFonts w:ascii="Times New Roman" w:hAnsi="Times New Roman"/>
-          <w:sz w:val="21"/>
-        </w:rPr>
-        <w:t>Business Analyst, part of the outsourcing partner delivering an AI-enabled Legal Operations platform onsite at VNG for their Legal and Compliance function</w:t>
-      </w:r>
-    </w:p>
-    <w:tbl>
-      <w:tblPr>
-        <w:tblW w:type="auto" w:w="0"/>
-        <w:tblLayout w:type="fixed"/>
-        <w:tblLook w:firstColumn="1" w:firstRow="1" w:lastColumn="0" w:lastRow="0" w:noHBand="0" w:noVBand="1" w:val="04A0"/>
-        <w:tblLayout w:type="fixed"/>
-        <w:tblW w:w="10080" w:type="dxa"/>
-      </w:tblPr>
-      <w:tblGrid>
-        <w:gridCol w:w="5256"/>
-        <w:gridCol w:w="5256"/>
-      </w:tblGrid>
-      <w:tr>
-        <w:tc>
-          <w:tcPr>
-            <w:tcW w:type="dxa" w:w="8928"/>
-            <w:tcW w:w="8928" w:type="dxa"/>
-            <w:tcMar>
-              <w:left w:w="0" w:type="dxa"/>
-              <w:right w:w="0" w:type="dxa"/>
-            </w:tcMar>
-          </w:tcPr>
-          <w:p>
-            <w:pPr>
-              <w:spacing w:after="0"/>
-            </w:pPr>
-            <w:r>
-              <w:rPr>
-                <w:rFonts w:ascii="Times New Roman" w:hAnsi="Times New Roman"/>
-                <w:b/>
-                <w:sz w:val="21"/>
-              </w:rPr>
-              <w:t xml:space="preserve">Founding Engineer | </w:t>
-            </w:r>
-            <w:hyperlink r:id="rId10">
               <w:r>
                 <w:rPr>
                   <w:rFonts w:ascii="Times New Roman" w:hAnsi="Times New Roman"/>
@@ -384,7 +296,7 @@
               </w:rPr>
               <w:t xml:space="preserve">Release-Acceptance Engineer | </w:t>
             </w:r>
-            <w:hyperlink r:id="rId11">
+            <w:hyperlink r:id="rId10">
               <w:r>
                 <w:rPr>
                   <w:rFonts w:ascii="Times New Roman" w:hAnsi="Times New Roman"/>
@@ -472,7 +384,7 @@
               </w:rPr>
               <w:t xml:space="preserve">Software Development Intern | </w:t>
             </w:r>
-            <w:hyperlink r:id="rId12">
+            <w:hyperlink r:id="rId11">
               <w:r>
                 <w:rPr>
                   <w:rFonts w:ascii="Times New Roman" w:hAnsi="Times New Roman"/>
@@ -688,7 +600,7 @@
       <w:pPr>
         <w:spacing w:after="0"/>
       </w:pPr>
-      <w:hyperlink r:id="rId13">
+      <w:hyperlink r:id="rId12">
         <w:r>
           <w:rPr>
             <w:rFonts w:ascii="Times New Roman" w:hAnsi="Times New Roman"/>
@@ -719,7 +631,7 @@
       <w:pPr>
         <w:spacing w:after="0"/>
       </w:pPr>
-      <w:hyperlink r:id="rId14">
+      <w:hyperlink r:id="rId13">
         <w:r>
           <w:rPr>
             <w:rFonts w:ascii="Times New Roman" w:hAnsi="Times New Roman"/>
@@ -750,7 +662,7 @@
       <w:pPr>
         <w:spacing w:after="0"/>
       </w:pPr>
-      <w:hyperlink r:id="rId15">
+      <w:hyperlink r:id="rId14">
         <w:r>
           <w:rPr>
             <w:rFonts w:ascii="Times New Roman" w:hAnsi="Times New Roman"/>
@@ -781,7 +693,7 @@
       <w:pPr>
         <w:spacing w:after="0"/>
       </w:pPr>
-      <w:hyperlink r:id="rId16">
+      <w:hyperlink r:id="rId15">
         <w:r>
           <w:rPr>
             <w:rFonts w:ascii="Times New Roman" w:hAnsi="Times New Roman"/>
@@ -812,7 +724,7 @@
       <w:pPr>
         <w:spacing w:after="0"/>
       </w:pPr>
-      <w:hyperlink r:id="rId17">
+      <w:hyperlink r:id="rId16">
         <w:r>
           <w:rPr>
             <w:rFonts w:ascii="Times New Roman" w:hAnsi="Times New Roman"/>
@@ -843,7 +755,7 @@
       <w:pPr>
         <w:spacing w:after="0"/>
       </w:pPr>
-      <w:hyperlink r:id="rId18">
+      <w:hyperlink r:id="rId17">
         <w:r>
           <w:rPr>
             <w:rFonts w:ascii="Times New Roman" w:hAnsi="Times New Roman"/>
@@ -874,7 +786,7 @@
       <w:pPr>
         <w:spacing w:after="0"/>
       </w:pPr>
-      <w:hyperlink r:id="rId19">
+      <w:hyperlink r:id="rId18">
         <w:r>
           <w:rPr>
             <w:rFonts w:ascii="Times New Roman" w:hAnsi="Times New Roman"/>

</xml_diff>

<commit_message>
Add BuddyUsage as an Open Source section
New section on the portfolio (between Selected Work and the AT
Protocol sections, linked from the nav and the intro page's Explore
pills) and a matching Open Source section on the Resume, right after
Projects. Content pulled from the actual README: cross-platform
Electron/TypeScript menu-bar app, local MCP server, 25 releases.

Trimmed the resume's PDF margins slightly to keep it at one page
after adding the section.

Co-Authored-By: Claude Sonnet 5 <noreply@anthropic.com>
</commit_message>
<xml_diff>
--- a/CV_DOCX/Sitt_Min_Thar_Resume.docx
+++ b/CV_DOCX/Sitt_Min_Thar_Resume.docx
@@ -827,6 +827,54 @@
           <w:color w:val="000000"/>
           <w:sz w:val="23"/>
         </w:rPr>
+        <w:t>OPEN SOURCE</w:t>
+      </w:r>
+    </w:p>
+    <w:p>
+      <w:pPr>
+        <w:spacing w:after="0"/>
+      </w:pPr>
+      <w:hyperlink r:id="rId19">
+        <w:r>
+          <w:rPr>
+            <w:rFonts w:ascii="Times New Roman" w:hAnsi="Times New Roman"/>
+            <w:sz w:val="22"/>
+            <w:color w:val="0563C1"/>
+            <w:u w:val="single"/>
+            <w:b/>
+          </w:rPr>
+          <w:t>BuddyUsage</w:t>
+        </w:r>
+      </w:hyperlink>
+    </w:p>
+    <w:p>
+      <w:pPr>
+        <w:pStyle w:val="ListBullet"/>
+        <w:spacing w:after="40"/>
+        <w:ind w:left="360"/>
+      </w:pPr>
+      <w:r>
+        <w:rPr>
+          <w:rFonts w:ascii="Times New Roman" w:hAnsi="Times New Roman"/>
+          <w:sz w:val="21"/>
+        </w:rPr>
+        <w:t>Menu-bar usage tracker for Claude, Codex, Gemini, Cursor and Copilot with pace prediction and local agent control; exposes usage as a local MCP server. 25 releases, macOS/Windows/Linux (Electron, TypeScript)</w:t>
+      </w:r>
+    </w:p>
+    <w:p>
+      <w:pPr>
+        <w:spacing w:before="100" w:after="20"/>
+        <w:pBdr>
+          <w:bottom w:val="single" w:sz="6" w:space="1" w:color="000000"/>
+        </w:pBdr>
+      </w:pPr>
+      <w:r>
+        <w:rPr>
+          <w:rFonts w:ascii="Times New Roman" w:hAnsi="Times New Roman"/>
+          <w:b/>
+          <w:color w:val="000000"/>
+          <w:sz w:val="23"/>
+        </w:rPr>
         <w:t>SKILLS</w:t>
       </w:r>
     </w:p>

</xml_diff>

<commit_message>
Drop DentalBridge from the resume, renumber portfolio projects
Portfolio: removed DentalBridge and Scholarship Announcement Web from
Selected Work, renumbered the remaining 8 entries sequentially.

Resume: swapped DentalBridge for HeadRoom (kept to one line to hold
the page at 1 page). Scholarship Announcement Web was never listed
on the resume, so nothing to remove there.

Co-Authored-By: Claude Sonnet 5 <noreply@anthropic.com>
</commit_message>
<xml_diff>
--- a/CV_DOCX/Sitt_Min_Thar_Resume.docx
+++ b/CV_DOCX/Sitt_Min_Thar_Resume.docx
@@ -702,6 +702,37 @@
             <w:u w:val="single"/>
             <w:b/>
           </w:rPr>
+          <w:t>HeadRoom</w:t>
+        </w:r>
+      </w:hyperlink>
+    </w:p>
+    <w:p>
+      <w:pPr>
+        <w:pStyle w:val="ListBullet"/>
+        <w:spacing w:after="40"/>
+        <w:ind w:left="360"/>
+      </w:pPr>
+      <w:r>
+        <w:rPr>
+          <w:rFonts w:ascii="Times New Roman" w:hAnsi="Times New Roman"/>
+          <w:sz w:val="21"/>
+        </w:rPr>
+        <w:t>Workplace-capacity negotiation tool built in 3 days for RMIT's ADC Hackathon 2026 (Neurodivergence track); ADHD-first Focus Mode and a zero-violation WCAG 2.2 AA audit (React, TypeScript, Supabase, Gemini AI)</w:t>
+      </w:r>
+    </w:p>
+    <w:p>
+      <w:pPr>
+        <w:spacing w:after="0"/>
+      </w:pPr>
+      <w:hyperlink r:id="rId16">
+        <w:r>
+          <w:rPr>
+            <w:rFonts w:ascii="Times New Roman" w:hAnsi="Times New Roman"/>
+            <w:sz w:val="22"/>
+            <w:color w:val="0563C1"/>
+            <w:u w:val="single"/>
+            <w:b/>
+          </w:rPr>
           <w:t>DataCleanr</w:t>
         </w:r>
       </w:hyperlink>
@@ -718,37 +749,6 @@
           <w:sz w:val="21"/>
         </w:rPr>
         <w:t>AI-powered dataset cleaning app with industry detection across 12 sectors and automated CSV/Excel harmonization (Python, Cython, JavaScript)</w:t>
-      </w:r>
-    </w:p>
-    <w:p>
-      <w:pPr>
-        <w:spacing w:after="0"/>
-      </w:pPr>
-      <w:hyperlink r:id="rId16">
-        <w:r>
-          <w:rPr>
-            <w:rFonts w:ascii="Times New Roman" w:hAnsi="Times New Roman"/>
-            <w:sz w:val="22"/>
-            <w:color w:val="0563C1"/>
-            <w:u w:val="single"/>
-            <w:b/>
-          </w:rPr>
-          <w:t>DentalBridge</w:t>
-        </w:r>
-      </w:hyperlink>
-    </w:p>
-    <w:p>
-      <w:pPr>
-        <w:pStyle w:val="ListBullet"/>
-        <w:spacing w:after="40"/>
-        <w:ind w:left="360"/>
-      </w:pPr>
-      <w:r>
-        <w:rPr>
-          <w:rFonts w:ascii="Times New Roman" w:hAnsi="Times New Roman"/>
-          <w:sz w:val="21"/>
-        </w:rPr>
-        <w:t>AI treatment coordinator using Google Gemini 1.5 Pro to translate clinical terminology into patient-friendly guidance (FastAPI, Next.js)</w:t>
       </w:r>
     </w:p>
     <w:p>

</xml_diff>

<commit_message>
Remove DataCleanr from the resume
Keeps the resume's project list consistent with the portfolio site,
which already swapped DataCleanr for HeadRoom.

Co-Authored-By: Claude Sonnet 5 <noreply@anthropic.com>
</commit_message>
<xml_diff>
--- a/CV_DOCX/Sitt_Min_Thar_Resume.docx
+++ b/CV_DOCX/Sitt_Min_Thar_Resume.docx
@@ -733,37 +733,6 @@
             <w:u w:val="single"/>
             <w:b/>
           </w:rPr>
-          <w:t>DataCleanr</w:t>
-        </w:r>
-      </w:hyperlink>
-    </w:p>
-    <w:p>
-      <w:pPr>
-        <w:pStyle w:val="ListBullet"/>
-        <w:spacing w:after="40"/>
-        <w:ind w:left="360"/>
-      </w:pPr>
-      <w:r>
-        <w:rPr>
-          <w:rFonts w:ascii="Times New Roman" w:hAnsi="Times New Roman"/>
-          <w:sz w:val="21"/>
-        </w:rPr>
-        <w:t>AI-powered dataset cleaning app with industry detection across 12 sectors and automated CSV/Excel harmonization (Python, Cython, JavaScript)</w:t>
-      </w:r>
-    </w:p>
-    <w:p>
-      <w:pPr>
-        <w:spacing w:after="0"/>
-      </w:pPr>
-      <w:hyperlink r:id="rId17">
-        <w:r>
-          <w:rPr>
-            <w:rFonts w:ascii="Times New Roman" w:hAnsi="Times New Roman"/>
-            <w:sz w:val="22"/>
-            <w:color w:val="0563C1"/>
-            <w:u w:val="single"/>
-            <w:b/>
-          </w:rPr>
           <w:t>Kamisori</w:t>
         </w:r>
       </w:hyperlink>
@@ -786,7 +755,7 @@
       <w:pPr>
         <w:spacing w:after="0"/>
       </w:pPr>
-      <w:hyperlink r:id="rId18">
+      <w:hyperlink r:id="rId17">
         <w:r>
           <w:rPr>
             <w:rFonts w:ascii="Times New Roman" w:hAnsi="Times New Roman"/>
@@ -834,7 +803,7 @@
       <w:pPr>
         <w:spacing w:after="0"/>
       </w:pPr>
-      <w:hyperlink r:id="rId19">
+      <w:hyperlink r:id="rId18">
         <w:r>
           <w:rPr>
             <w:rFonts w:ascii="Times New Roman" w:hAnsi="Times New Roman"/>

</xml_diff>